<commit_message>
car stages + artifacts
</commit_message>
<xml_diff>
--- a/CICD Notes.docx
+++ b/CICD Notes.docx
@@ -38,17 +38,8 @@
           <w:b/>
           <w:bCs/>
         </w:rPr>
-        <w:t xml:space="preserve"> by Valentin </w:t>
-      </w:r>
-      <w:proofErr w:type="spellStart"/>
-      <w:r>
-        <w:rPr>
-          <w:b/>
-          <w:bCs/>
-        </w:rPr>
-        <w:t>Despa</w:t>
-      </w:r>
-      <w:proofErr w:type="spellEnd"/>
+        <w:t xml:space="preserve"> by Valentin Despa</w:t>
+      </w:r>
     </w:p>
     <w:p>
       <w:pPr>
@@ -88,15 +79,7 @@
         </w:numPr>
       </w:pPr>
       <w:r>
-        <w:t xml:space="preserve">Will take a website, build it, test it, and </w:t>
-      </w:r>
-      <w:proofErr w:type="gramStart"/>
-      <w:r>
-        <w:t>deploy</w:t>
-      </w:r>
-      <w:proofErr w:type="gramEnd"/>
-      <w:r>
-        <w:t xml:space="preserve"> to AWS</w:t>
+        <w:t>Will take a website, build it, test it, and deploy to AWS</w:t>
       </w:r>
     </w:p>
     <w:p>
@@ -132,15 +115,7 @@
         </w:numPr>
       </w:pPr>
       <w:r>
-        <w:t xml:space="preserve">GitLab – </w:t>
-      </w:r>
-      <w:proofErr w:type="spellStart"/>
-      <w:r>
-        <w:t>devops</w:t>
-      </w:r>
-      <w:proofErr w:type="spellEnd"/>
-      <w:r>
-        <w:t xml:space="preserve"> platform</w:t>
+        <w:t>GitLab – devops platform</w:t>
       </w:r>
       <w:r>
         <w:t>, Git: code version control</w:t>
@@ -152,15 +127,7 @@
         <w:t xml:space="preserve"> pipelines with their CI/CD</w:t>
       </w:r>
       <w:r>
-        <w:t xml:space="preserve"> (compiles, </w:t>
-      </w:r>
-      <w:proofErr w:type="gramStart"/>
-      <w:r>
-        <w:t>runs</w:t>
-      </w:r>
-      <w:proofErr w:type="gramEnd"/>
-      <w:r>
-        <w:t xml:space="preserve"> tests, creates a new version of software, and deploys to server)</w:t>
+        <w:t xml:space="preserve"> (compiles, runs tests, creates a new version of software, and deploys to server)</w:t>
       </w:r>
     </w:p>
     <w:p/>
@@ -194,20 +161,7 @@
         <w:t>Log into GitLab, go into Web IDE</w:t>
       </w:r>
       <w:r>
-        <w:t xml:space="preserve"> &gt; create file &gt; naming starts with </w:t>
-      </w:r>
-      <w:proofErr w:type="gramStart"/>
-      <w:r>
-        <w:t>“.</w:t>
-      </w:r>
-      <w:proofErr w:type="spellStart"/>
-      <w:r>
-        <w:t>gitlab</w:t>
-      </w:r>
-      <w:proofErr w:type="spellEnd"/>
-      <w:proofErr w:type="gramEnd"/>
-      <w:r>
-        <w:t>”</w:t>
+        <w:t xml:space="preserve"> &gt; create file &gt; naming starts with “.gitlab”</w:t>
       </w:r>
     </w:p>
     <w:p>
@@ -416,241 +370,171 @@
           <w:bCs/>
           <w:u w:val="single"/>
         </w:rPr>
-        <w:t xml:space="preserve"> </w:t>
-      </w:r>
-      <w:proofErr w:type="gramStart"/>
+        <w:t xml:space="preserve"> - .gitlab-ci.yml</w:t>
+      </w:r>
+    </w:p>
+    <w:p>
+      <w:pPr>
+        <w:pStyle w:val="ListParagraph"/>
+        <w:numPr>
+          <w:ilvl w:val="0"/>
+          <w:numId w:val="1"/>
+        </w:numPr>
+      </w:pPr>
+      <w:r>
+        <w:t>One task feeds to another</w:t>
+      </w:r>
+    </w:p>
+    <w:p>
+      <w:pPr>
+        <w:pStyle w:val="ListParagraph"/>
+        <w:numPr>
+          <w:ilvl w:val="0"/>
+          <w:numId w:val="1"/>
+        </w:numPr>
+      </w:pPr>
+      <w:r>
+        <w:t>Defining built and test stages</w:t>
+      </w:r>
+    </w:p>
+    <w:p>
+      <w:pPr>
+        <w:pStyle w:val="ListParagraph"/>
+        <w:numPr>
+          <w:ilvl w:val="0"/>
+          <w:numId w:val="1"/>
+        </w:numPr>
+      </w:pPr>
+      <w:r>
+        <w:t>To define pipeline &gt; open the web ID of a project</w:t>
+      </w:r>
+    </w:p>
+    <w:p>
+      <w:pPr>
+        <w:pStyle w:val="ListParagraph"/>
+        <w:numPr>
+          <w:ilvl w:val="0"/>
+          <w:numId w:val="1"/>
+        </w:numPr>
+      </w:pPr>
+      <w:r>
+        <w:t>Define in yaml as a job</w:t>
+      </w:r>
+      <w:r>
+        <w:t>:</w:t>
+      </w:r>
+    </w:p>
+    <w:p>
+      <w:pPr>
+        <w:pStyle w:val="ListParagraph"/>
+        <w:numPr>
+          <w:ilvl w:val="1"/>
+          <w:numId w:val="1"/>
+        </w:numPr>
+      </w:pPr>
+      <w:r>
+        <w:t>Instructions are linux commands because gitlab uses docker containers based on linux to run commands</w:t>
+      </w:r>
+    </w:p>
+    <w:p>
+      <w:pPr>
+        <w:pStyle w:val="ListParagraph"/>
+        <w:numPr>
+          <w:ilvl w:val="2"/>
+          <w:numId w:val="1"/>
+        </w:numPr>
+      </w:pPr>
+      <w:r>
+        <w:t>Using alpine for now</w:t>
+      </w:r>
+    </w:p>
+    <w:p>
+      <w:pPr>
+        <w:pStyle w:val="ListParagraph"/>
+        <w:numPr>
+          <w:ilvl w:val="1"/>
+          <w:numId w:val="1"/>
+        </w:numPr>
+      </w:pPr>
+      <w:r>
+        <w:t>Script: list of commands</w:t>
+      </w:r>
+    </w:p>
+    <w:p>
+      <w:pPr>
+        <w:pStyle w:val="ListParagraph"/>
+        <w:numPr>
+          <w:ilvl w:val="2"/>
+          <w:numId w:val="1"/>
+        </w:numPr>
+      </w:pPr>
+      <w:r>
+        <w:t>Echo: print building the car</w:t>
+      </w:r>
+    </w:p>
+    <w:p>
+      <w:pPr>
+        <w:pStyle w:val="ListParagraph"/>
+        <w:numPr>
+          <w:ilvl w:val="2"/>
+          <w:numId w:val="1"/>
+        </w:numPr>
+      </w:pPr>
+      <w:r>
+        <w:t>Make a directory called build</w:t>
+      </w:r>
+    </w:p>
+    <w:p>
+      <w:pPr>
+        <w:pStyle w:val="ListParagraph"/>
+        <w:numPr>
+          <w:ilvl w:val="2"/>
+          <w:numId w:val="1"/>
+        </w:numPr>
+      </w:pPr>
+      <w:r>
+        <w:t>Then go into build directory</w:t>
+      </w:r>
+    </w:p>
+    <w:p>
+      <w:pPr>
+        <w:pStyle w:val="ListParagraph"/>
+        <w:numPr>
+          <w:ilvl w:val="2"/>
+          <w:numId w:val="1"/>
+        </w:numPr>
+      </w:pPr>
+      <w:r>
+        <w:t>And then create txt file</w:t>
+      </w:r>
+      <w:r>
+        <w:t xml:space="preserve"> (touch command)</w:t>
+      </w:r>
+    </w:p>
+    <w:p>
+      <w:pPr>
+        <w:pStyle w:val="ListParagraph"/>
+        <w:numPr>
+          <w:ilvl w:val="2"/>
+          <w:numId w:val="1"/>
+        </w:numPr>
+      </w:pPr>
+      <w:r>
+        <w:t xml:space="preserve">Then print “chassis” and put this output into car.txt </w:t>
+      </w:r>
+    </w:p>
+    <w:p>
+      <w:pPr>
+        <w:pStyle w:val="ListParagraph"/>
+        <w:numPr>
+          <w:ilvl w:val="1"/>
+          <w:numId w:val="1"/>
+        </w:numPr>
+      </w:pPr>
       <w:r>
         <w:rPr>
-          <w:b/>
-          <w:bCs/>
-          <w:u w:val="single"/>
+          <w:noProof/>
         </w:rPr>
-        <w:t>- .</w:t>
-      </w:r>
-      <w:proofErr w:type="spellStart"/>
-      <w:proofErr w:type="gramEnd"/>
-      <w:r>
-        <w:rPr>
-          <w:b/>
-          <w:bCs/>
-          <w:u w:val="single"/>
-        </w:rPr>
-        <w:t>gitlab-ci.yml</w:t>
-      </w:r>
-      <w:proofErr w:type="spellEnd"/>
-    </w:p>
-    <w:p>
-      <w:pPr>
-        <w:pStyle w:val="ListParagraph"/>
-        <w:numPr>
-          <w:ilvl w:val="0"/>
-          <w:numId w:val="1"/>
-        </w:numPr>
-      </w:pPr>
-      <w:r>
-        <w:t xml:space="preserve">One task </w:t>
-      </w:r>
-      <w:proofErr w:type="gramStart"/>
-      <w:r>
-        <w:t>feeds</w:t>
-      </w:r>
-      <w:proofErr w:type="gramEnd"/>
-      <w:r>
-        <w:t xml:space="preserve"> to another</w:t>
-      </w:r>
-    </w:p>
-    <w:p>
-      <w:pPr>
-        <w:pStyle w:val="ListParagraph"/>
-        <w:numPr>
-          <w:ilvl w:val="0"/>
-          <w:numId w:val="1"/>
-        </w:numPr>
-      </w:pPr>
-      <w:r>
-        <w:t>Defining built and test stages</w:t>
-      </w:r>
-    </w:p>
-    <w:p>
-      <w:pPr>
-        <w:pStyle w:val="ListParagraph"/>
-        <w:numPr>
-          <w:ilvl w:val="0"/>
-          <w:numId w:val="1"/>
-        </w:numPr>
-      </w:pPr>
-      <w:r>
-        <w:t>To define pipeline &gt; open the web ID of a project</w:t>
-      </w:r>
-    </w:p>
-    <w:p>
-      <w:pPr>
-        <w:pStyle w:val="ListParagraph"/>
-        <w:numPr>
-          <w:ilvl w:val="0"/>
-          <w:numId w:val="1"/>
-        </w:numPr>
-      </w:pPr>
-      <w:r>
-        <w:t xml:space="preserve">Define in </w:t>
-      </w:r>
-      <w:proofErr w:type="spellStart"/>
-      <w:r>
-        <w:t>yaml</w:t>
-      </w:r>
-      <w:proofErr w:type="spellEnd"/>
-      <w:r>
-        <w:t xml:space="preserve"> as a job</w:t>
-      </w:r>
-      <w:r>
-        <w:t>:</w:t>
-      </w:r>
-    </w:p>
-    <w:p>
-      <w:pPr>
-        <w:pStyle w:val="ListParagraph"/>
-        <w:numPr>
-          <w:ilvl w:val="1"/>
-          <w:numId w:val="1"/>
-        </w:numPr>
-      </w:pPr>
-      <w:r>
-        <w:t xml:space="preserve">Instructions are </w:t>
-      </w:r>
-      <w:proofErr w:type="spellStart"/>
-      <w:r>
-        <w:t>linux</w:t>
-      </w:r>
-      <w:proofErr w:type="spellEnd"/>
-      <w:r>
-        <w:t xml:space="preserve"> commands because </w:t>
-      </w:r>
-      <w:proofErr w:type="spellStart"/>
-      <w:r>
-        <w:t>gitlab</w:t>
-      </w:r>
-      <w:proofErr w:type="spellEnd"/>
-      <w:r>
-        <w:t xml:space="preserve"> uses docker containers based on </w:t>
-      </w:r>
-      <w:proofErr w:type="spellStart"/>
-      <w:r>
-        <w:t>linux</w:t>
-      </w:r>
-      <w:proofErr w:type="spellEnd"/>
-      <w:r>
-        <w:t xml:space="preserve"> to run commands</w:t>
-      </w:r>
-    </w:p>
-    <w:p>
-      <w:pPr>
-        <w:pStyle w:val="ListParagraph"/>
-        <w:numPr>
-          <w:ilvl w:val="2"/>
-          <w:numId w:val="1"/>
-        </w:numPr>
-      </w:pPr>
-      <w:r>
-        <w:t xml:space="preserve">Using </w:t>
-      </w:r>
-      <w:proofErr w:type="gramStart"/>
-      <w:r>
-        <w:t>alpine</w:t>
-      </w:r>
-      <w:proofErr w:type="gramEnd"/>
-      <w:r>
-        <w:t xml:space="preserve"> for </w:t>
-      </w:r>
-      <w:proofErr w:type="gramStart"/>
-      <w:r>
-        <w:t>now</w:t>
-      </w:r>
-      <w:proofErr w:type="gramEnd"/>
-    </w:p>
-    <w:p>
-      <w:pPr>
-        <w:pStyle w:val="ListParagraph"/>
-        <w:numPr>
-          <w:ilvl w:val="1"/>
-          <w:numId w:val="1"/>
-        </w:numPr>
-      </w:pPr>
-      <w:r>
-        <w:t>Script: list of commands</w:t>
-      </w:r>
-    </w:p>
-    <w:p>
-      <w:pPr>
-        <w:pStyle w:val="ListParagraph"/>
-        <w:numPr>
-          <w:ilvl w:val="2"/>
-          <w:numId w:val="1"/>
-        </w:numPr>
-      </w:pPr>
-      <w:r>
-        <w:t>Echo: print building the car</w:t>
-      </w:r>
-    </w:p>
-    <w:p>
-      <w:pPr>
-        <w:pStyle w:val="ListParagraph"/>
-        <w:numPr>
-          <w:ilvl w:val="2"/>
-          <w:numId w:val="1"/>
-        </w:numPr>
-      </w:pPr>
-      <w:r>
-        <w:t>Make a directory called build</w:t>
-      </w:r>
-    </w:p>
-    <w:p>
-      <w:pPr>
-        <w:pStyle w:val="ListParagraph"/>
-        <w:numPr>
-          <w:ilvl w:val="2"/>
-          <w:numId w:val="1"/>
-        </w:numPr>
-      </w:pPr>
-      <w:r>
-        <w:t>Then go into build directory</w:t>
-      </w:r>
-    </w:p>
-    <w:p>
-      <w:pPr>
-        <w:pStyle w:val="ListParagraph"/>
-        <w:numPr>
-          <w:ilvl w:val="2"/>
-          <w:numId w:val="1"/>
-        </w:numPr>
-      </w:pPr>
-      <w:r>
-        <w:t>And then create txt file</w:t>
-      </w:r>
-      <w:r>
-        <w:t xml:space="preserve"> (touch command)</w:t>
-      </w:r>
-    </w:p>
-    <w:p>
-      <w:pPr>
-        <w:pStyle w:val="ListParagraph"/>
-        <w:numPr>
-          <w:ilvl w:val="2"/>
-          <w:numId w:val="1"/>
-        </w:numPr>
-      </w:pPr>
-      <w:r>
-        <w:t xml:space="preserve">Then print “chassis” and put this output into car.txt </w:t>
-      </w:r>
-    </w:p>
-    <w:p>
-      <w:pPr>
-        <w:pStyle w:val="ListParagraph"/>
-        <w:numPr>
-          <w:ilvl w:val="1"/>
-          <w:numId w:val="1"/>
-        </w:numPr>
-      </w:pPr>
-      <w:r>
         <w:drawing>
           <wp:inline distT="0" distB="0" distL="0" distR="0" wp14:anchorId="2CA97C6E" wp14:editId="7D175B5A">
             <wp:extent cx="5525271" cy="3324689"/>
@@ -697,6 +581,9 @@
         </w:numPr>
       </w:pPr>
       <w:r>
+        <w:rPr>
+          <w:noProof/>
+        </w:rPr>
         <w:lastRenderedPageBreak/>
         <w:drawing>
           <wp:inline distT="0" distB="0" distL="0" distR="0" wp14:anchorId="13026801" wp14:editId="12E7D4C4">
@@ -749,23 +636,7 @@
     </w:p>
     <w:p>
       <w:r>
-        <w:t xml:space="preserve">Yes, the build directory and car.txt file </w:t>
-      </w:r>
-      <w:proofErr w:type="gramStart"/>
-      <w:r>
-        <w:t>were</w:t>
-      </w:r>
-      <w:proofErr w:type="gramEnd"/>
-      <w:r>
-        <w:t xml:space="preserve"> </w:t>
-      </w:r>
-      <w:proofErr w:type="gramStart"/>
-      <w:r>
-        <w:t>actually created</w:t>
-      </w:r>
-      <w:proofErr w:type="gramEnd"/>
-      <w:r>
-        <w:t xml:space="preserve"> during the job run, but only temporarily inside an isolated Docker container.</w:t>
+        <w:t>Yes, the build directory and car.txt file were actually created during the job run, but only temporarily inside an isolated Docker container.</w:t>
       </w:r>
     </w:p>
     <w:p>
@@ -794,15 +665,7 @@
         </w:numPr>
       </w:pPr>
       <w:r>
-        <w:t xml:space="preserve">Inside that container, </w:t>
-      </w:r>
-      <w:proofErr w:type="spellStart"/>
-      <w:r>
-        <w:t>mkdir</w:t>
-      </w:r>
-      <w:proofErr w:type="spellEnd"/>
-      <w:r>
-        <w:t xml:space="preserve"> build created a real directory, touch car.txt created a real file, and the echo commands wrote content to it</w:t>
+        <w:t>Inside that container, mkdir build created a real directory, touch car.txt created a real file, and the echo commands wrote content to it</w:t>
       </w:r>
     </w:p>
     <w:p>
@@ -814,51 +677,17 @@
         </w:numPr>
       </w:pPr>
       <w:r>
-        <w:t xml:space="preserve">When the job </w:t>
-      </w:r>
-      <w:proofErr w:type="gramStart"/>
-      <w:r>
-        <w:t>finished</w:t>
-      </w:r>
-      <w:proofErr w:type="gramEnd"/>
-      <w:r>
-        <w:t>, the container was destroyed along with everything inside it</w:t>
-      </w:r>
-    </w:p>
-    <w:p>
-      <w:proofErr w:type="gramStart"/>
-      <w:r>
-        <w:t>So</w:t>
-      </w:r>
-      <w:proofErr w:type="gramEnd"/>
-      <w:r>
-        <w:t xml:space="preserve"> at this moment in time, no, the build/ directory and car.txt no longer exist anywhere. They were real during the job </w:t>
-      </w:r>
-      <w:proofErr w:type="gramStart"/>
-      <w:r>
-        <w:t>execution, but</w:t>
-      </w:r>
-      <w:proofErr w:type="gramEnd"/>
-      <w:r>
-        <w:t xml:space="preserve"> are now gone.</w:t>
-      </w:r>
-    </w:p>
-    <w:p>
-      <w:r>
-        <w:t xml:space="preserve">To persist files between jobs or after the pipeline, you'd need to use artifacts in </w:t>
-      </w:r>
-      <w:proofErr w:type="gramStart"/>
-      <w:r>
-        <w:t>your .</w:t>
-      </w:r>
-      <w:proofErr w:type="spellStart"/>
-      <w:proofErr w:type="gramEnd"/>
-      <w:r>
-        <w:t>gitlab-ci.yml</w:t>
-      </w:r>
-      <w:proofErr w:type="spellEnd"/>
-      <w:r>
-        <w:t>, like:</w:t>
+        <w:t>When the job finished, the container was destroyed along with everything inside it</w:t>
+      </w:r>
+    </w:p>
+    <w:p>
+      <w:r>
+        <w:t>So at this moment in time, no, the build/ directory and car.txt no longer exist anywhere. They were real during the job execution, but are now gone.</w:t>
+      </w:r>
+    </w:p>
+    <w:p>
+      <w:r>
+        <w:t>To persist files between jobs or after the pipeline, you'd need to use artifacts in your .gitlab-ci.yml, like:</w:t>
       </w:r>
     </w:p>
     <w:p>
@@ -890,11 +719,49 @@
     </w:p>
     <w:p>
       <w:pPr>
+        <w:pStyle w:val="ListParagraph"/>
+        <w:numPr>
+          <w:ilvl w:val="0"/>
+          <w:numId w:val="1"/>
+        </w:numPr>
+      </w:pPr>
+      <w:r>
         <w:rPr>
           <w:b/>
           <w:bCs/>
         </w:rPr>
-      </w:pPr>
+        <w:t>Gitlab does not save anything unless told so</w:t>
+      </w:r>
+      <w:r>
+        <w:t xml:space="preserve"> – we typically do not commit files and store in repository. </w:t>
+      </w:r>
+    </w:p>
+    <w:p/>
+    <w:p>
+      <w:r>
+        <w:t>Now we’re going to create a job to test the file</w:t>
+      </w:r>
+    </w:p>
+    <w:p>
+      <w:pPr>
+        <w:pStyle w:val="ListParagraph"/>
+        <w:numPr>
+          <w:ilvl w:val="0"/>
+          <w:numId w:val="1"/>
+        </w:numPr>
+      </w:pPr>
+      <w:r>
+        <w:t xml:space="preserve">Test -f </w:t>
+      </w:r>
+      <w:r>
+        <w:sym w:font="Wingdings" w:char="F0E0"/>
+      </w:r>
+      <w:r>
+        <w:t xml:space="preserve"> tests if a file exists</w:t>
+      </w:r>
+      <w:r>
+        <w:t>, specify inside folder build since this is where we built it</w:t>
+      </w:r>
     </w:p>
     <w:p>
       <w:pPr>
@@ -903,15 +770,446 @@
           <w:bCs/>
         </w:rPr>
       </w:pPr>
-    </w:p>
-    <w:p>
-      <w:pPr>
+      <w:r>
         <w:rPr>
           <w:b/>
           <w:bCs/>
         </w:rPr>
-      </w:pPr>
-    </w:p>
+        <w:drawing>
+          <wp:inline distT="0" distB="0" distL="0" distR="0" wp14:anchorId="067B7F2F" wp14:editId="4ACAD6C3">
+            <wp:extent cx="5734850" cy="5039428"/>
+            <wp:effectExtent l="0" t="0" r="0" b="8890"/>
+            <wp:docPr id="383541598" name="Picture 1"/>
+            <wp:cNvGraphicFramePr>
+              <a:graphicFrameLocks xmlns:a="http://schemas.openxmlformats.org/drawingml/2006/main" noChangeAspect="1"/>
+            </wp:cNvGraphicFramePr>
+            <a:graphic xmlns:a="http://schemas.openxmlformats.org/drawingml/2006/main">
+              <a:graphicData uri="http://schemas.openxmlformats.org/drawingml/2006/picture">
+                <pic:pic xmlns:pic="http://schemas.openxmlformats.org/drawingml/2006/picture">
+                  <pic:nvPicPr>
+                    <pic:cNvPr id="383541598" name=""/>
+                    <pic:cNvPicPr/>
+                  </pic:nvPicPr>
+                  <pic:blipFill>
+                    <a:blip r:embed="rId11"/>
+                    <a:stretch>
+                      <a:fillRect/>
+                    </a:stretch>
+                  </pic:blipFill>
+                  <pic:spPr>
+                    <a:xfrm>
+                      <a:off x="0" y="0"/>
+                      <a:ext cx="5734850" cy="5039428"/>
+                    </a:xfrm>
+                    <a:prstGeom prst="rect">
+                      <a:avLst/>
+                    </a:prstGeom>
+                  </pic:spPr>
+                </pic:pic>
+              </a:graphicData>
+            </a:graphic>
+          </wp:inline>
+        </w:drawing>
+      </w:r>
+    </w:p>
+    <w:p>
+      <w:r>
+        <w:rPr>
+          <w:b/>
+          <w:bCs/>
+        </w:rPr>
+        <w:t xml:space="preserve">THIS FAILS. </w:t>
+      </w:r>
+      <w:r>
+        <w:t>Why? Open logs, we see test -f build/car happens and then we get error code 1, so we know it never got to grep meaning it failed at test</w:t>
+      </w:r>
+    </w:p>
+    <w:p>
+      <w:pPr>
+        <w:pStyle w:val="ListParagraph"/>
+        <w:numPr>
+          <w:ilvl w:val="0"/>
+          <w:numId w:val="1"/>
+        </w:numPr>
+      </w:pPr>
+      <w:r>
+        <w:lastRenderedPageBreak/>
+        <w:t>Issue is that build_car and test_car are running in parallel. So it fails</w:t>
+      </w:r>
+      <w:r>
+        <w:t xml:space="preserve"> because we do not want to build and test at the same time. We want build_car in the build stage and test_car in the test stage</w:t>
+      </w:r>
+    </w:p>
+    <w:p>
+      <w:pPr>
+        <w:pStyle w:val="ListParagraph"/>
+        <w:numPr>
+          <w:ilvl w:val="0"/>
+          <w:numId w:val="1"/>
+        </w:numPr>
+      </w:pPr>
+      <w:r>
+        <w:t xml:space="preserve">If you do not specify a stage, it will add </w:t>
+      </w:r>
+      <w:r>
+        <w:t>job to test stage</w:t>
+      </w:r>
+    </w:p>
+    <w:p>
+      <w:pPr>
+        <w:pStyle w:val="ListParagraph"/>
+        <w:numPr>
+          <w:ilvl w:val="1"/>
+          <w:numId w:val="1"/>
+        </w:numPr>
+      </w:pPr>
+      <w:r>
+        <w:drawing>
+          <wp:inline distT="0" distB="0" distL="0" distR="0" wp14:anchorId="3E17CED2" wp14:editId="32662030">
+            <wp:extent cx="2734057" cy="2000529"/>
+            <wp:effectExtent l="0" t="0" r="9525" b="0"/>
+            <wp:docPr id="825811276" name="Picture 1"/>
+            <wp:cNvGraphicFramePr>
+              <a:graphicFrameLocks xmlns:a="http://schemas.openxmlformats.org/drawingml/2006/main" noChangeAspect="1"/>
+            </wp:cNvGraphicFramePr>
+            <a:graphic xmlns:a="http://schemas.openxmlformats.org/drawingml/2006/main">
+              <a:graphicData uri="http://schemas.openxmlformats.org/drawingml/2006/picture">
+                <pic:pic xmlns:pic="http://schemas.openxmlformats.org/drawingml/2006/picture">
+                  <pic:nvPicPr>
+                    <pic:cNvPr id="825811276" name=""/>
+                    <pic:cNvPicPr/>
+                  </pic:nvPicPr>
+                  <pic:blipFill>
+                    <a:blip r:embed="rId12"/>
+                    <a:stretch>
+                      <a:fillRect/>
+                    </a:stretch>
+                  </pic:blipFill>
+                  <pic:spPr>
+                    <a:xfrm>
+                      <a:off x="0" y="0"/>
+                      <a:ext cx="2734057" cy="2000529"/>
+                    </a:xfrm>
+                    <a:prstGeom prst="rect">
+                      <a:avLst/>
+                    </a:prstGeom>
+                  </pic:spPr>
+                </pic:pic>
+              </a:graphicData>
+            </a:graphic>
+          </wp:inline>
+        </w:drawing>
+      </w:r>
+    </w:p>
+    <w:p>
+      <w:pPr>
+        <w:pStyle w:val="ListParagraph"/>
+        <w:numPr>
+          <w:ilvl w:val="0"/>
+          <w:numId w:val="1"/>
+        </w:numPr>
+      </w:pPr>
+      <w:r>
+        <w:t>SOLUTION: specify stages</w:t>
+      </w:r>
+    </w:p>
+    <w:p>
+      <w:r>
+        <w:lastRenderedPageBreak/>
+        <w:drawing>
+          <wp:inline distT="0" distB="0" distL="0" distR="0" wp14:anchorId="42544A90" wp14:editId="36BD44FD">
+            <wp:extent cx="5449060" cy="6325483"/>
+            <wp:effectExtent l="0" t="0" r="0" b="0"/>
+            <wp:docPr id="166187217" name="Picture 1"/>
+            <wp:cNvGraphicFramePr>
+              <a:graphicFrameLocks xmlns:a="http://schemas.openxmlformats.org/drawingml/2006/main" noChangeAspect="1"/>
+            </wp:cNvGraphicFramePr>
+            <a:graphic xmlns:a="http://schemas.openxmlformats.org/drawingml/2006/main">
+              <a:graphicData uri="http://schemas.openxmlformats.org/drawingml/2006/picture">
+                <pic:pic xmlns:pic="http://schemas.openxmlformats.org/drawingml/2006/picture">
+                  <pic:nvPicPr>
+                    <pic:cNvPr id="166187217" name=""/>
+                    <pic:cNvPicPr/>
+                  </pic:nvPicPr>
+                  <pic:blipFill>
+                    <a:blip r:embed="rId13"/>
+                    <a:stretch>
+                      <a:fillRect/>
+                    </a:stretch>
+                  </pic:blipFill>
+                  <pic:spPr>
+                    <a:xfrm>
+                      <a:off x="0" y="0"/>
+                      <a:ext cx="5449060" cy="6325483"/>
+                    </a:xfrm>
+                    <a:prstGeom prst="rect">
+                      <a:avLst/>
+                    </a:prstGeom>
+                  </pic:spPr>
+                </pic:pic>
+              </a:graphicData>
+            </a:graphic>
+          </wp:inline>
+        </w:drawing>
+      </w:r>
+    </w:p>
+    <w:p/>
+    <w:p>
+      <w:r>
+        <w:lastRenderedPageBreak/>
+        <w:drawing>
+          <wp:inline distT="0" distB="0" distL="0" distR="0" wp14:anchorId="36B3B826" wp14:editId="471DC809">
+            <wp:extent cx="5943600" cy="1546225"/>
+            <wp:effectExtent l="0" t="0" r="0" b="0"/>
+            <wp:docPr id="1553159954" name="Picture 1"/>
+            <wp:cNvGraphicFramePr>
+              <a:graphicFrameLocks xmlns:a="http://schemas.openxmlformats.org/drawingml/2006/main" noChangeAspect="1"/>
+            </wp:cNvGraphicFramePr>
+            <a:graphic xmlns:a="http://schemas.openxmlformats.org/drawingml/2006/main">
+              <a:graphicData uri="http://schemas.openxmlformats.org/drawingml/2006/picture">
+                <pic:pic xmlns:pic="http://schemas.openxmlformats.org/drawingml/2006/picture">
+                  <pic:nvPicPr>
+                    <pic:cNvPr id="1553159954" name=""/>
+                    <pic:cNvPicPr/>
+                  </pic:nvPicPr>
+                  <pic:blipFill>
+                    <a:blip r:embed="rId14"/>
+                    <a:stretch>
+                      <a:fillRect/>
+                    </a:stretch>
+                  </pic:blipFill>
+                  <pic:spPr>
+                    <a:xfrm>
+                      <a:off x="0" y="0"/>
+                      <a:ext cx="5943600" cy="1546225"/>
+                    </a:xfrm>
+                    <a:prstGeom prst="rect">
+                      <a:avLst/>
+                    </a:prstGeom>
+                  </pic:spPr>
+                </pic:pic>
+              </a:graphicData>
+            </a:graphic>
+          </wp:inline>
+        </w:drawing>
+      </w:r>
+    </w:p>
+    <w:p/>
+    <w:p>
+      <w:r>
+        <w:t>Issue: test_car still failing</w:t>
+      </w:r>
+    </w:p>
+    <w:p>
+      <w:pPr>
+        <w:pStyle w:val="ListParagraph"/>
+        <w:numPr>
+          <w:ilvl w:val="0"/>
+          <w:numId w:val="1"/>
+        </w:numPr>
+      </w:pPr>
+      <w:r>
+        <w:t>Because we use the same alpine container which is built and destroyed after the job runs</w:t>
+      </w:r>
+    </w:p>
+    <w:p>
+      <w:pPr>
+        <w:pStyle w:val="ListParagraph"/>
+        <w:numPr>
+          <w:ilvl w:val="0"/>
+          <w:numId w:val="1"/>
+        </w:numPr>
+      </w:pPr>
+      <w:r>
+        <w:t>Can tell GitLab to keep it instead by defining job artifact (made during build process)</w:t>
+      </w:r>
+    </w:p>
+    <w:p>
+      <w:r>
+        <w:lastRenderedPageBreak/>
+        <w:drawing>
+          <wp:inline distT="0" distB="0" distL="0" distR="0" wp14:anchorId="4080CA83" wp14:editId="27E5E1A0">
+            <wp:extent cx="5820587" cy="7030431"/>
+            <wp:effectExtent l="0" t="0" r="8890" b="0"/>
+            <wp:docPr id="2070130112" name="Picture 1"/>
+            <wp:cNvGraphicFramePr>
+              <a:graphicFrameLocks xmlns:a="http://schemas.openxmlformats.org/drawingml/2006/main" noChangeAspect="1"/>
+            </wp:cNvGraphicFramePr>
+            <a:graphic xmlns:a="http://schemas.openxmlformats.org/drawingml/2006/main">
+              <a:graphicData uri="http://schemas.openxmlformats.org/drawingml/2006/picture">
+                <pic:pic xmlns:pic="http://schemas.openxmlformats.org/drawingml/2006/picture">
+                  <pic:nvPicPr>
+                    <pic:cNvPr id="2070130112" name=""/>
+                    <pic:cNvPicPr/>
+                  </pic:nvPicPr>
+                  <pic:blipFill>
+                    <a:blip r:embed="rId15"/>
+                    <a:stretch>
+                      <a:fillRect/>
+                    </a:stretch>
+                  </pic:blipFill>
+                  <pic:spPr>
+                    <a:xfrm>
+                      <a:off x="0" y="0"/>
+                      <a:ext cx="5820587" cy="7030431"/>
+                    </a:xfrm>
+                    <a:prstGeom prst="rect">
+                      <a:avLst/>
+                    </a:prstGeom>
+                  </pic:spPr>
+                </pic:pic>
+              </a:graphicData>
+            </a:graphic>
+          </wp:inline>
+        </w:drawing>
+      </w:r>
+    </w:p>
+    <w:p>
+      <w:r>
+        <w:t>Says “keep everything in build directory”</w:t>
+      </w:r>
+    </w:p>
+    <w:p/>
+    <w:p/>
+    <w:p>
+      <w:r>
+        <w:lastRenderedPageBreak/>
+        <w:t>Still getting error! But now on next step</w:t>
+      </w:r>
+    </w:p>
+    <w:p>
+      <w:r>
+        <w:drawing>
+          <wp:inline distT="0" distB="0" distL="0" distR="0" wp14:anchorId="544D2A02" wp14:editId="2720134D">
+            <wp:extent cx="5943600" cy="1922780"/>
+            <wp:effectExtent l="0" t="0" r="0" b="1270"/>
+            <wp:docPr id="2054351633" name="Picture 1"/>
+            <wp:cNvGraphicFramePr>
+              <a:graphicFrameLocks xmlns:a="http://schemas.openxmlformats.org/drawingml/2006/main" noChangeAspect="1"/>
+            </wp:cNvGraphicFramePr>
+            <a:graphic xmlns:a="http://schemas.openxmlformats.org/drawingml/2006/main">
+              <a:graphicData uri="http://schemas.openxmlformats.org/drawingml/2006/picture">
+                <pic:pic xmlns:pic="http://schemas.openxmlformats.org/drawingml/2006/picture">
+                  <pic:nvPicPr>
+                    <pic:cNvPr id="2054351633" name=""/>
+                    <pic:cNvPicPr/>
+                  </pic:nvPicPr>
+                  <pic:blipFill>
+                    <a:blip r:embed="rId16"/>
+                    <a:stretch>
+                      <a:fillRect/>
+                    </a:stretch>
+                  </pic:blipFill>
+                  <pic:spPr>
+                    <a:xfrm>
+                      <a:off x="0" y="0"/>
+                      <a:ext cx="5943600" cy="1922780"/>
+                    </a:xfrm>
+                    <a:prstGeom prst="rect">
+                      <a:avLst/>
+                    </a:prstGeom>
+                  </pic:spPr>
+                </pic:pic>
+              </a:graphicData>
+            </a:graphic>
+          </wp:inline>
+        </w:drawing>
+      </w:r>
+    </w:p>
+    <w:p>
+      <w:r>
+        <w:t>It’s because we need to specify</w:t>
+      </w:r>
+      <w:r>
+        <w:t xml:space="preserve"> relative path to grep command</w:t>
+      </w:r>
+    </w:p>
+    <w:p>
+      <w:r>
+        <w:lastRenderedPageBreak/>
+        <w:drawing>
+          <wp:inline distT="0" distB="0" distL="0" distR="0" wp14:anchorId="39F7ECA9" wp14:editId="592BE167">
+            <wp:extent cx="5943600" cy="6579870"/>
+            <wp:effectExtent l="0" t="0" r="0" b="0"/>
+            <wp:docPr id="1300879002" name="Picture 1"/>
+            <wp:cNvGraphicFramePr>
+              <a:graphicFrameLocks xmlns:a="http://schemas.openxmlformats.org/drawingml/2006/main" noChangeAspect="1"/>
+            </wp:cNvGraphicFramePr>
+            <a:graphic xmlns:a="http://schemas.openxmlformats.org/drawingml/2006/main">
+              <a:graphicData uri="http://schemas.openxmlformats.org/drawingml/2006/picture">
+                <pic:pic xmlns:pic="http://schemas.openxmlformats.org/drawingml/2006/picture">
+                  <pic:nvPicPr>
+                    <pic:cNvPr id="1300879002" name=""/>
+                    <pic:cNvPicPr/>
+                  </pic:nvPicPr>
+                  <pic:blipFill>
+                    <a:blip r:embed="rId17"/>
+                    <a:stretch>
+                      <a:fillRect/>
+                    </a:stretch>
+                  </pic:blipFill>
+                  <pic:spPr>
+                    <a:xfrm>
+                      <a:off x="0" y="0"/>
+                      <a:ext cx="5943600" cy="6579870"/>
+                    </a:xfrm>
+                    <a:prstGeom prst="rect">
+                      <a:avLst/>
+                    </a:prstGeom>
+                  </pic:spPr>
+                </pic:pic>
+              </a:graphicData>
+            </a:graphic>
+          </wp:inline>
+        </w:drawing>
+      </w:r>
+    </w:p>
+    <w:p>
+      <w:r>
+        <w:lastRenderedPageBreak/>
+        <w:drawing>
+          <wp:inline distT="0" distB="0" distL="0" distR="0" wp14:anchorId="61F742E8" wp14:editId="65CE96D8">
+            <wp:extent cx="5896798" cy="1514686"/>
+            <wp:effectExtent l="0" t="0" r="8890" b="9525"/>
+            <wp:docPr id="329280113" name="Picture 1"/>
+            <wp:cNvGraphicFramePr>
+              <a:graphicFrameLocks xmlns:a="http://schemas.openxmlformats.org/drawingml/2006/main" noChangeAspect="1"/>
+            </wp:cNvGraphicFramePr>
+            <a:graphic xmlns:a="http://schemas.openxmlformats.org/drawingml/2006/main">
+              <a:graphicData uri="http://schemas.openxmlformats.org/drawingml/2006/picture">
+                <pic:pic xmlns:pic="http://schemas.openxmlformats.org/drawingml/2006/picture">
+                  <pic:nvPicPr>
+                    <pic:cNvPr id="329280113" name=""/>
+                    <pic:cNvPicPr/>
+                  </pic:nvPicPr>
+                  <pic:blipFill>
+                    <a:blip r:embed="rId18"/>
+                    <a:stretch>
+                      <a:fillRect/>
+                    </a:stretch>
+                  </pic:blipFill>
+                  <pic:spPr>
+                    <a:xfrm>
+                      <a:off x="0" y="0"/>
+                      <a:ext cx="5896798" cy="1514686"/>
+                    </a:xfrm>
+                    <a:prstGeom prst="rect">
+                      <a:avLst/>
+                    </a:prstGeom>
+                  </pic:spPr>
+                </pic:pic>
+              </a:graphicData>
+            </a:graphic>
+          </wp:inline>
+        </w:drawing>
+      </w:r>
+    </w:p>
+    <w:p>
+      <w:r>
+        <w:t>Execution happens from left to right</w:t>
+      </w:r>
+    </w:p>
+    <w:p/>
     <w:p>
       <w:pPr>
         <w:rPr>

</xml_diff>